<commit_message>
Mẫu PBL-01: cách điền dạng infographic, bỏ nền vàng
Co-Authored-By: Claude Opus 5.5 <noreply@anthropic.com>
</commit_message>
<xml_diff>
--- a/hop-giao-ban-tuan3-thang10-2026/mau-PBL-01-phieu-bao-loi-HIS-Brain.docx
+++ b/hop-giao-ban-tuan3-thang10-2026/mau-PBL-01-phieu-bao-loi-HIS-Brain.docx
@@ -210,21 +210,11 @@
       <w:r>
         <w:rPr>
           <w:rFonts w:ascii="Calibri" w:cs="Calibri" w:eastAsia="Calibri" w:hAnsi="Calibri"/>
-          <w:b/>
-          <w:bCs/>
-          <w:sz w:val="20"/>
-          <w:szCs w:val="20"/>
-        </w:rPr>
-        <w:t xml:space="preserve">Ô nền vàng </w:t>
-      </w:r>
-      <w:r>
-        <w:rPr>
-          <w:rFonts w:ascii="Calibri" w:cs="Calibri" w:eastAsia="Calibri" w:hAnsi="Calibri"/>
           <w:color w:val="595959"/>
           <w:sz w:val="20"/>
           <w:szCs w:val="20"/>
         </w:rPr>
-        <w:t xml:space="preserve">là ô cần điền. Đánh dấu ô chọn bằng cách thay ☐ thành ☒.</w:t>
+        <w:t xml:space="preserve">Điền vào ô trống. Đánh dấu ô chọn bằng cách thay ☐ thành ☒.</w:t>
       </w:r>
     </w:p>
     <w:p>
@@ -313,7 +303,6 @@
               <w:bottom w:val="single" w:color="B9A7CB" w:sz="4"/>
               <w:right w:val="single" w:color="B9A7CB" w:sz="4"/>
             </w:tcBorders>
-            <w:shd w:fill="FFF8DC" w:color="auto" w:val="clear"/>
             <w:tcMar>
               <w:top w:type="dxa" w:w="70"/>
               <w:left w:type="dxa" w:w="110"/>
@@ -379,7 +368,6 @@
               <w:bottom w:val="single" w:color="B9A7CB" w:sz="4"/>
               <w:right w:val="single" w:color="B9A7CB" w:sz="4"/>
             </w:tcBorders>
-            <w:shd w:fill="FFF8DC" w:color="auto" w:val="clear"/>
             <w:tcMar>
               <w:top w:type="dxa" w:w="70"/>
               <w:left w:type="dxa" w:w="110"/>
@@ -452,7 +440,6 @@
               <w:bottom w:val="single" w:color="B9A7CB" w:sz="4"/>
               <w:right w:val="single" w:color="B9A7CB" w:sz="4"/>
             </w:tcBorders>
-            <w:shd w:fill="FFF8DC" w:color="auto" w:val="clear"/>
             <w:tcMar>
               <w:top w:type="dxa" w:w="70"/>
               <w:left w:type="dxa" w:w="110"/>
@@ -524,7 +511,6 @@
               <w:bottom w:val="single" w:color="B9A7CB" w:sz="4"/>
               <w:right w:val="single" w:color="B9A7CB" w:sz="4"/>
             </w:tcBorders>
-            <w:shd w:fill="FFF8DC" w:color="auto" w:val="clear"/>
             <w:tcMar>
               <w:top w:type="dxa" w:w="70"/>
               <w:left w:type="dxa" w:w="110"/>
@@ -590,7 +576,6 @@
               <w:bottom w:val="single" w:color="B9A7CB" w:sz="4"/>
               <w:right w:val="single" w:color="B9A7CB" w:sz="4"/>
             </w:tcBorders>
-            <w:shd w:fill="FFF8DC" w:color="auto" w:val="clear"/>
             <w:tcMar>
               <w:top w:type="dxa" w:w="70"/>
               <w:left w:type="dxa" w:w="110"/>
@@ -662,7 +647,6 @@
               <w:bottom w:val="single" w:color="B9A7CB" w:sz="4"/>
               <w:right w:val="single" w:color="B9A7CB" w:sz="4"/>
             </w:tcBorders>
-            <w:shd w:fill="FFF8DC" w:color="auto" w:val="clear"/>
             <w:tcMar>
               <w:top w:type="dxa" w:w="70"/>
               <w:left w:type="dxa" w:w="110"/>
@@ -728,7 +712,6 @@
               <w:bottom w:val="single" w:color="B9A7CB" w:sz="4"/>
               <w:right w:val="single" w:color="B9A7CB" w:sz="4"/>
             </w:tcBorders>
-            <w:shd w:fill="FFF8DC" w:color="auto" w:val="clear"/>
             <w:tcMar>
               <w:top w:type="dxa" w:w="70"/>
               <w:left w:type="dxa" w:w="110"/>
@@ -773,174 +756,388 @@
         <w:t xml:space="preserve">II. CÁCH ĐIỀN</w:t>
       </w:r>
     </w:p>
-    <w:p>
-      <w:pPr>
-        <w:pStyle w:val="ListParagraph"/>
-        <w:numPr>
-          <w:ilvl w:val="0"/>
-          <w:numId w:val="2"/>
-        </w:numPr>
-        <w:spacing w:after="40" w:before="0" w:line="264"/>
-      </w:pPr>
-      <w:r>
-        <w:rPr>
-          <w:rFonts w:ascii="Calibri" w:cs="Calibri" w:eastAsia="Calibri" w:hAnsi="Calibri"/>
-          <w:b/>
-          <w:bCs/>
-          <w:sz w:val="20"/>
-          <w:szCs w:val="20"/>
-        </w:rPr>
-        <w:t xml:space="preserve">Mỗi lỗi điền một bảng ở mục IV. </w:t>
-      </w:r>
-      <w:r>
-        <w:rPr>
-          <w:rFonts w:ascii="Calibri" w:cs="Calibri" w:eastAsia="Calibri" w:hAnsi="Calibri"/>
-          <w:sz w:val="20"/>
-          <w:szCs w:val="20"/>
-        </w:rPr>
-        <w:t xml:space="preserve">Có nhiều lỗi thì chép thêm bảng, đánh số tiếp (Lỗi số 4, 5…).</w:t>
-      </w:r>
-    </w:p>
-    <w:p>
-      <w:pPr>
-        <w:pStyle w:val="ListParagraph"/>
-        <w:numPr>
-          <w:ilvl w:val="0"/>
-          <w:numId w:val="2"/>
-        </w:numPr>
-        <w:spacing w:after="40" w:before="0" w:line="264"/>
-      </w:pPr>
-      <w:r>
-        <w:rPr>
-          <w:rFonts w:ascii="Calibri" w:cs="Calibri" w:eastAsia="Calibri" w:hAnsi="Calibri"/>
-          <w:b/>
-          <w:bCs/>
-          <w:sz w:val="20"/>
-          <w:szCs w:val="20"/>
-        </w:rPr>
-        <w:t xml:space="preserve">Bắt buộc có ảnh chụp màn hình. </w:t>
-      </w:r>
-      <w:r>
-        <w:rPr>
-          <w:rFonts w:ascii="Calibri" w:cs="Calibri" w:eastAsia="Calibri" w:hAnsi="Calibri"/>
-          <w:sz w:val="20"/>
-          <w:szCs w:val="20"/>
-        </w:rPr>
-        <w:t xml:space="preserve">Khoanh đỏ đúng chỗ sai; che (bôi đen) họ tên, số điện thoại, CCCD của khách trước khi dán ảnh. Xem ví dụ ở Phụ lục 1.</w:t>
-      </w:r>
-    </w:p>
-    <w:p>
-      <w:pPr>
-        <w:pStyle w:val="ListParagraph"/>
-        <w:numPr>
-          <w:ilvl w:val="0"/>
-          <w:numId w:val="2"/>
-        </w:numPr>
-        <w:spacing w:after="40" w:before="0" w:line="264"/>
-      </w:pPr>
-      <w:r>
-        <w:rPr>
-          <w:rFonts w:ascii="Calibri" w:cs="Calibri" w:eastAsia="Calibri" w:hAnsi="Calibri"/>
-          <w:b/>
-          <w:bCs/>
-          <w:sz w:val="20"/>
-          <w:szCs w:val="20"/>
-        </w:rPr>
-        <w:t xml:space="preserve">Ghi từng bước thao tác dẫn tới lỗi </w:t>
-      </w:r>
-      <w:r>
-        <w:rPr>
-          <w:rFonts w:ascii="Calibri" w:cs="Calibri" w:eastAsia="Calibri" w:hAnsi="Calibri"/>
-          <w:sz w:val="20"/>
-          <w:szCs w:val="20"/>
-        </w:rPr>
-        <w:t xml:space="preserve">để bên phần mềm làm lại được; ghi mã phiếu, mã chứng từ, ngày giờ nếu có.</w:t>
-      </w:r>
-    </w:p>
-    <w:p>
-      <w:pPr>
-        <w:pStyle w:val="ListParagraph"/>
-        <w:numPr>
-          <w:ilvl w:val="0"/>
-          <w:numId w:val="2"/>
-        </w:numPr>
-        <w:spacing w:after="40" w:before="0" w:line="264"/>
-      </w:pPr>
-      <w:r>
-        <w:rPr>
-          <w:rFonts w:ascii="Calibri" w:cs="Calibri" w:eastAsia="Calibri" w:hAnsi="Calibri"/>
-          <w:b/>
-          <w:bCs/>
-          <w:sz w:val="20"/>
-          <w:szCs w:val="20"/>
-        </w:rPr>
-        <w:t xml:space="preserve">Lỗi đã có trong Báo cáo tổng hợp 19/10/2026: </w:t>
-      </w:r>
-      <w:r>
-        <w:rPr>
-          <w:rFonts w:ascii="Calibri" w:cs="Calibri" w:eastAsia="Calibri" w:hAnsi="Calibri"/>
-          <w:sz w:val="20"/>
-          <w:szCs w:val="20"/>
-        </w:rPr>
-        <w:t xml:space="preserve">ghi mã cũ (ví dụ H2.1), chỉ báo lại khi lỗi vẫn còn hoặc tái phát sau khi sửa.</w:t>
-      </w:r>
-    </w:p>
-    <w:p>
-      <w:pPr>
-        <w:pStyle w:val="ListParagraph"/>
-        <w:numPr>
-          <w:ilvl w:val="0"/>
-          <w:numId w:val="2"/>
-        </w:numPr>
-        <w:spacing w:after="40" w:before="0" w:line="264"/>
-      </w:pPr>
-      <w:r>
-        <w:rPr>
-          <w:rFonts w:ascii="Calibri" w:cs="Calibri" w:eastAsia="Calibri" w:hAnsi="Calibri"/>
-          <w:b/>
-          <w:bCs/>
-          <w:sz w:val="20"/>
-          <w:szCs w:val="20"/>
-        </w:rPr>
-        <w:t xml:space="preserve">Chọn mã nhóm và mức ưu tiên </w:t>
-      </w:r>
-      <w:r>
-        <w:rPr>
-          <w:rFonts w:ascii="Calibri" w:cs="Calibri" w:eastAsia="Calibri" w:hAnsi="Calibri"/>
-          <w:sz w:val="20"/>
-          <w:szCs w:val="20"/>
-        </w:rPr>
-        <w:t xml:space="preserve">theo bảng ở Phụ lục 2.</w:t>
-      </w:r>
-    </w:p>
-    <w:p>
-      <w:pPr>
-        <w:pStyle w:val="ListParagraph"/>
-        <w:numPr>
-          <w:ilvl w:val="0"/>
-          <w:numId w:val="2"/>
-        </w:numPr>
-        <w:spacing w:after="40" w:before="0" w:line="264"/>
-      </w:pPr>
-      <w:r>
-        <w:rPr>
-          <w:rFonts w:ascii="Calibri" w:cs="Calibri" w:eastAsia="Calibri" w:hAnsi="Calibri"/>
-          <w:b/>
-          <w:bCs/>
-          <w:sz w:val="20"/>
-          <w:szCs w:val="20"/>
-        </w:rPr>
-        <w:t xml:space="preserve">Đặt tên file: </w:t>
-      </w:r>
-      <w:r>
-        <w:rPr>
-          <w:rFonts w:ascii="Calibri" w:cs="Calibri" w:eastAsia="Calibri" w:hAnsi="Calibri"/>
-          <w:sz w:val="20"/>
-          <w:szCs w:val="20"/>
-        </w:rPr>
-        <w:t xml:space="preserve">BaoLoi_Phòng_Họ tên_ngày gửi.docx (ví dụ BaoLoi_KeToan_NguyenVanA_23.10.2026.docx). Kỳ không có lỗi mới vẫn gửi phiếu, ghi “Không phát sinh lỗi mới” ở mục III.</w:t>
-      </w:r>
-    </w:p>
+    <w:tbl>
+      <w:tblPr>
+        <w:tblW w:type="dxa" w:w="9638"/>
+        <w:tblBorders>
+          <w:top w:val="single" w:color="auto" w:sz="4"/>
+          <w:left w:val="single" w:color="auto" w:sz="4"/>
+          <w:bottom w:val="single" w:color="auto" w:sz="4"/>
+          <w:right w:val="single" w:color="auto" w:sz="4"/>
+          <w:insideH w:val="single" w:color="auto" w:sz="4"/>
+          <w:insideV w:val="single" w:color="auto" w:sz="4"/>
+        </w:tblBorders>
+      </w:tblPr>
+      <w:tblGrid>
+        <w:gridCol w:w="3212"/>
+        <w:gridCol w:w="3213"/>
+        <w:gridCol w:w="3213"/>
+      </w:tblGrid>
+      <w:tr>
+        <w:trPr>
+          <w:cantSplit/>
+        </w:trPr>
+        <w:tc>
+          <w:tcPr>
+            <w:tcW w:type="dxa" w:w="3212"/>
+            <w:tcBorders>
+              <w:top w:val="single" w:color="DD5A28" w:sz="24"/>
+              <w:left w:val="single" w:color="FFFFFF" w:sz="12"/>
+              <w:bottom w:val="single" w:color="FFFFFF" w:sz="2"/>
+              <w:right w:val="single" w:color="FFFFFF" w:sz="12"/>
+            </w:tcBorders>
+            <w:shd w:fill="F3EEF7" w:color="auto" w:val="clear"/>
+            <w:tcMar>
+              <w:top w:type="dxa" w:w="100"/>
+              <w:left w:type="dxa" w:w="140"/>
+              <w:bottom w:type="dxa" w:w="100"/>
+              <w:right w:type="dxa" w:w="120"/>
+            </w:tcMar>
+          </w:tcPr>
+          <w:p>
+            <w:pPr>
+              <w:spacing w:after="30"/>
+            </w:pPr>
+            <w:r>
+              <w:rPr>
+                <w:rFonts w:ascii="Calibri" w:cs="Calibri" w:eastAsia="Calibri" w:hAnsi="Calibri"/>
+                <w:b/>
+                <w:bCs/>
+                <w:color w:val="DD5A28"/>
+                <w:sz w:val="36"/>
+                <w:szCs w:val="36"/>
+              </w:rPr>
+              <w:t xml:space="preserve">1  </w:t>
+            </w:r>
+            <w:r>
+              <w:rPr>
+                <w:rFonts w:ascii="Calibri" w:cs="Calibri" w:eastAsia="Calibri" w:hAnsi="Calibri"/>
+                <w:b/>
+                <w:bCs/>
+                <w:color w:val="613087"/>
+                <w:sz w:val="22"/>
+                <w:szCs w:val="22"/>
+              </w:rPr>
+              <w:t xml:space="preserve">Mỗi lỗi một bảng</w:t>
+            </w:r>
+          </w:p>
+          <w:p>
+            <w:pPr>
+              <w:spacing w:after="0" w:before="0" w:line="264"/>
+            </w:pPr>
+            <w:r>
+              <w:rPr>
+                <w:rFonts w:ascii="Calibri" w:cs="Calibri" w:eastAsia="Calibri" w:hAnsi="Calibri"/>
+                <w:color w:val="333333"/>
+                <w:sz w:val="19"/>
+                <w:szCs w:val="19"/>
+              </w:rPr>
+              <w:t xml:space="preserve">Mục IV. Lỗi thêm: chép bảng, đánh số 4, 5…</w:t>
+            </w:r>
+          </w:p>
+        </w:tc>
+        <w:tc>
+          <w:tcPr>
+            <w:tcW w:type="dxa" w:w="3213"/>
+            <w:tcBorders>
+              <w:top w:val="single" w:color="DD5A28" w:sz="24"/>
+              <w:left w:val="single" w:color="FFFFFF" w:sz="12"/>
+              <w:bottom w:val="single" w:color="FFFFFF" w:sz="2"/>
+              <w:right w:val="single" w:color="FFFFFF" w:sz="12"/>
+            </w:tcBorders>
+            <w:shd w:fill="F3EEF7" w:color="auto" w:val="clear"/>
+            <w:tcMar>
+              <w:top w:type="dxa" w:w="100"/>
+              <w:left w:type="dxa" w:w="140"/>
+              <w:bottom w:type="dxa" w:w="100"/>
+              <w:right w:type="dxa" w:w="120"/>
+            </w:tcMar>
+          </w:tcPr>
+          <w:p>
+            <w:pPr>
+              <w:spacing w:after="30"/>
+            </w:pPr>
+            <w:r>
+              <w:rPr>
+                <w:rFonts w:ascii="Calibri" w:cs="Calibri" w:eastAsia="Calibri" w:hAnsi="Calibri"/>
+                <w:b/>
+                <w:bCs/>
+                <w:color w:val="DD5A28"/>
+                <w:sz w:val="36"/>
+                <w:szCs w:val="36"/>
+              </w:rPr>
+              <w:t xml:space="preserve">2  </w:t>
+            </w:r>
+            <w:r>
+              <w:rPr>
+                <w:rFonts w:ascii="Calibri" w:cs="Calibri" w:eastAsia="Calibri" w:hAnsi="Calibri"/>
+                <w:b/>
+                <w:bCs/>
+                <w:color w:val="613087"/>
+                <w:sz w:val="22"/>
+                <w:szCs w:val="22"/>
+              </w:rPr>
+              <w:t xml:space="preserve">Có ảnh chụp</w:t>
+            </w:r>
+          </w:p>
+          <w:p>
+            <w:pPr>
+              <w:spacing w:after="0" w:before="0" w:line="264"/>
+            </w:pPr>
+            <w:r>
+              <w:rPr>
+                <w:rFonts w:ascii="Calibri" w:cs="Calibri" w:eastAsia="Calibri" w:hAnsi="Calibri"/>
+                <w:color w:val="333333"/>
+                <w:sz w:val="19"/>
+                <w:szCs w:val="19"/>
+              </w:rPr>
+              <w:t xml:space="preserve">Khoanh đỏ chỗ sai. Che tên, SĐT, CCCD khách. Xem Phụ lục 1</w:t>
+            </w:r>
+          </w:p>
+        </w:tc>
+        <w:tc>
+          <w:tcPr>
+            <w:tcW w:type="dxa" w:w="3213"/>
+            <w:tcBorders>
+              <w:top w:val="single" w:color="DD5A28" w:sz="24"/>
+              <w:left w:val="single" w:color="FFFFFF" w:sz="12"/>
+              <w:bottom w:val="single" w:color="FFFFFF" w:sz="2"/>
+              <w:right w:val="single" w:color="FFFFFF" w:sz="12"/>
+            </w:tcBorders>
+            <w:shd w:fill="F3EEF7" w:color="auto" w:val="clear"/>
+            <w:tcMar>
+              <w:top w:type="dxa" w:w="100"/>
+              <w:left w:type="dxa" w:w="140"/>
+              <w:bottom w:type="dxa" w:w="100"/>
+              <w:right w:type="dxa" w:w="120"/>
+            </w:tcMar>
+          </w:tcPr>
+          <w:p>
+            <w:pPr>
+              <w:spacing w:after="30"/>
+            </w:pPr>
+            <w:r>
+              <w:rPr>
+                <w:rFonts w:ascii="Calibri" w:cs="Calibri" w:eastAsia="Calibri" w:hAnsi="Calibri"/>
+                <w:b/>
+                <w:bCs/>
+                <w:color w:val="DD5A28"/>
+                <w:sz w:val="36"/>
+                <w:szCs w:val="36"/>
+              </w:rPr>
+              <w:t xml:space="preserve">3  </w:t>
+            </w:r>
+            <w:r>
+              <w:rPr>
+                <w:rFonts w:ascii="Calibri" w:cs="Calibri" w:eastAsia="Calibri" w:hAnsi="Calibri"/>
+                <w:b/>
+                <w:bCs/>
+                <w:color w:val="613087"/>
+                <w:sz w:val="22"/>
+                <w:szCs w:val="22"/>
+              </w:rPr>
+              <w:t xml:space="preserve">Ghi các bước</w:t>
+            </w:r>
+          </w:p>
+          <w:p>
+            <w:pPr>
+              <w:spacing w:after="0" w:before="0" w:line="264"/>
+            </w:pPr>
+            <w:r>
+              <w:rPr>
+                <w:rFonts w:ascii="Calibri" w:cs="Calibri" w:eastAsia="Calibri" w:hAnsi="Calibri"/>
+                <w:color w:val="333333"/>
+                <w:sz w:val="19"/>
+                <w:szCs w:val="19"/>
+              </w:rPr>
+              <w:t xml:space="preserve">Thao tác dẫn tới lỗi; mã phiếu, ngày giờ</w:t>
+            </w:r>
+          </w:p>
+        </w:tc>
+      </w:tr>
+      <w:tr>
+        <w:trPr>
+          <w:cantSplit/>
+        </w:trPr>
+        <w:tc>
+          <w:tcPr>
+            <w:tcW w:type="dxa" w:w="3212"/>
+            <w:tcBorders>
+              <w:top w:val="single" w:color="DD5A28" w:sz="24"/>
+              <w:left w:val="single" w:color="FFFFFF" w:sz="12"/>
+              <w:bottom w:val="single" w:color="FFFFFF" w:sz="2"/>
+              <w:right w:val="single" w:color="FFFFFF" w:sz="12"/>
+            </w:tcBorders>
+            <w:shd w:fill="F3EEF7" w:color="auto" w:val="clear"/>
+            <w:tcMar>
+              <w:top w:type="dxa" w:w="100"/>
+              <w:left w:type="dxa" w:w="140"/>
+              <w:bottom w:type="dxa" w:w="100"/>
+              <w:right w:type="dxa" w:w="120"/>
+            </w:tcMar>
+          </w:tcPr>
+          <w:p>
+            <w:pPr>
+              <w:spacing w:after="30"/>
+            </w:pPr>
+            <w:r>
+              <w:rPr>
+                <w:rFonts w:ascii="Calibri" w:cs="Calibri" w:eastAsia="Calibri" w:hAnsi="Calibri"/>
+                <w:b/>
+                <w:bCs/>
+                <w:color w:val="DD5A28"/>
+                <w:sz w:val="36"/>
+                <w:szCs w:val="36"/>
+              </w:rPr>
+              <w:t xml:space="preserve">4  </w:t>
+            </w:r>
+            <w:r>
+              <w:rPr>
+                <w:rFonts w:ascii="Calibri" w:cs="Calibri" w:eastAsia="Calibri" w:hAnsi="Calibri"/>
+                <w:b/>
+                <w:bCs/>
+                <w:color w:val="613087"/>
+                <w:sz w:val="22"/>
+                <w:szCs w:val="22"/>
+              </w:rPr>
+              <w:t xml:space="preserve">Lỗi đã báo</w:t>
+            </w:r>
+          </w:p>
+          <w:p>
+            <w:pPr>
+              <w:spacing w:after="0" w:before="0" w:line="264"/>
+            </w:pPr>
+            <w:r>
+              <w:rPr>
+                <w:rFonts w:ascii="Calibri" w:cs="Calibri" w:eastAsia="Calibri" w:hAnsi="Calibri"/>
+                <w:color w:val="333333"/>
+                <w:sz w:val="19"/>
+                <w:szCs w:val="19"/>
+              </w:rPr>
+              <w:t xml:space="preserve">Ghi mã cũ (VD H2.1). Chỉ báo khi còn lỗi / tái phát</w:t>
+            </w:r>
+          </w:p>
+        </w:tc>
+        <w:tc>
+          <w:tcPr>
+            <w:tcW w:type="dxa" w:w="3213"/>
+            <w:tcBorders>
+              <w:top w:val="single" w:color="DD5A28" w:sz="24"/>
+              <w:left w:val="single" w:color="FFFFFF" w:sz="12"/>
+              <w:bottom w:val="single" w:color="FFFFFF" w:sz="2"/>
+              <w:right w:val="single" w:color="FFFFFF" w:sz="12"/>
+            </w:tcBorders>
+            <w:shd w:fill="F3EEF7" w:color="auto" w:val="clear"/>
+            <w:tcMar>
+              <w:top w:type="dxa" w:w="100"/>
+              <w:left w:type="dxa" w:w="140"/>
+              <w:bottom w:type="dxa" w:w="100"/>
+              <w:right w:type="dxa" w:w="120"/>
+            </w:tcMar>
+          </w:tcPr>
+          <w:p>
+            <w:pPr>
+              <w:spacing w:after="30"/>
+            </w:pPr>
+            <w:r>
+              <w:rPr>
+                <w:rFonts w:ascii="Calibri" w:cs="Calibri" w:eastAsia="Calibri" w:hAnsi="Calibri"/>
+                <w:b/>
+                <w:bCs/>
+                <w:color w:val="DD5A28"/>
+                <w:sz w:val="36"/>
+                <w:szCs w:val="36"/>
+              </w:rPr>
+              <w:t xml:space="preserve">5  </w:t>
+            </w:r>
+            <w:r>
+              <w:rPr>
+                <w:rFonts w:ascii="Calibri" w:cs="Calibri" w:eastAsia="Calibri" w:hAnsi="Calibri"/>
+                <w:b/>
+                <w:bCs/>
+                <w:color w:val="613087"/>
+                <w:sz w:val="22"/>
+                <w:szCs w:val="22"/>
+              </w:rPr>
+              <w:t xml:space="preserve">Mã nhóm, mức</w:t>
+            </w:r>
+          </w:p>
+          <w:p>
+            <w:pPr>
+              <w:spacing w:after="0" w:before="0" w:line="264"/>
+            </w:pPr>
+            <w:r>
+              <w:rPr>
+                <w:rFonts w:ascii="Calibri" w:cs="Calibri" w:eastAsia="Calibri" w:hAnsi="Calibri"/>
+                <w:color w:val="333333"/>
+                <w:sz w:val="19"/>
+                <w:szCs w:val="19"/>
+              </w:rPr>
+              <w:t xml:space="preserve">Chọn theo bảng Phụ lục 2</w:t>
+            </w:r>
+          </w:p>
+        </w:tc>
+        <w:tc>
+          <w:tcPr>
+            <w:tcW w:type="dxa" w:w="3213"/>
+            <w:tcBorders>
+              <w:top w:val="single" w:color="DD5A28" w:sz="24"/>
+              <w:left w:val="single" w:color="FFFFFF" w:sz="12"/>
+              <w:bottom w:val="single" w:color="FFFFFF" w:sz="2"/>
+              <w:right w:val="single" w:color="FFFFFF" w:sz="12"/>
+            </w:tcBorders>
+            <w:shd w:fill="F3EEF7" w:color="auto" w:val="clear"/>
+            <w:tcMar>
+              <w:top w:type="dxa" w:w="100"/>
+              <w:left w:type="dxa" w:w="140"/>
+              <w:bottom w:type="dxa" w:w="100"/>
+              <w:right w:type="dxa" w:w="120"/>
+            </w:tcMar>
+          </w:tcPr>
+          <w:p>
+            <w:pPr>
+              <w:spacing w:after="30"/>
+            </w:pPr>
+            <w:r>
+              <w:rPr>
+                <w:rFonts w:ascii="Calibri" w:cs="Calibri" w:eastAsia="Calibri" w:hAnsi="Calibri"/>
+                <w:b/>
+                <w:bCs/>
+                <w:color w:val="DD5A28"/>
+                <w:sz w:val="36"/>
+                <w:szCs w:val="36"/>
+              </w:rPr>
+              <w:t xml:space="preserve">6  </w:t>
+            </w:r>
+            <w:r>
+              <w:rPr>
+                <w:rFonts w:ascii="Calibri" w:cs="Calibri" w:eastAsia="Calibri" w:hAnsi="Calibri"/>
+                <w:b/>
+                <w:bCs/>
+                <w:color w:val="613087"/>
+                <w:sz w:val="22"/>
+                <w:szCs w:val="22"/>
+              </w:rPr>
+              <w:t xml:space="preserve">Tên file</w:t>
+            </w:r>
+          </w:p>
+          <w:p>
+            <w:pPr>
+              <w:spacing w:after="0" w:before="0" w:line="264"/>
+            </w:pPr>
+            <w:r>
+              <w:rPr>
+                <w:rFonts w:ascii="Calibri" w:cs="Calibri" w:eastAsia="Calibri" w:hAnsi="Calibri"/>
+                <w:color w:val="333333"/>
+                <w:sz w:val="19"/>
+                <w:szCs w:val="19"/>
+              </w:rPr>
+              <w:t xml:space="preserve">BaoLoi_Phòng_Họ tên_ngày.docx. Không có lỗi: ghi “Không phát sinh lỗi mới”</w:t>
+            </w:r>
+          </w:p>
+        </w:tc>
+      </w:tr>
+    </w:tbl>
     <w:p>
       <w:pPr>
         <w:keepNext/>
@@ -1248,7 +1445,6 @@
               <w:bottom w:val="single" w:color="B9A7CB" w:sz="4"/>
               <w:right w:val="single" w:color="B9A7CB" w:sz="4"/>
             </w:tcBorders>
-            <w:shd w:fill="FFF8DC" w:color="auto" w:val="clear"/>
             <w:tcMar>
               <w:top w:type="dxa" w:w="70"/>
               <w:left w:type="dxa" w:w="110"/>
@@ -1280,7 +1476,6 @@
               <w:bottom w:val="single" w:color="B9A7CB" w:sz="4"/>
               <w:right w:val="single" w:color="B9A7CB" w:sz="4"/>
             </w:tcBorders>
-            <w:shd w:fill="FFF8DC" w:color="auto" w:val="clear"/>
             <w:tcMar>
               <w:top w:type="dxa" w:w="70"/>
               <w:left w:type="dxa" w:w="110"/>
@@ -1312,7 +1507,6 @@
               <w:bottom w:val="single" w:color="B9A7CB" w:sz="4"/>
               <w:right w:val="single" w:color="B9A7CB" w:sz="4"/>
             </w:tcBorders>
-            <w:shd w:fill="FFF8DC" w:color="auto" w:val="clear"/>
             <w:tcMar>
               <w:top w:type="dxa" w:w="70"/>
               <w:left w:type="dxa" w:w="110"/>
@@ -1344,7 +1538,6 @@
               <w:bottom w:val="single" w:color="B9A7CB" w:sz="4"/>
               <w:right w:val="single" w:color="B9A7CB" w:sz="4"/>
             </w:tcBorders>
-            <w:shd w:fill="FFF8DC" w:color="auto" w:val="clear"/>
             <w:tcMar>
               <w:top w:type="dxa" w:w="70"/>
               <w:left w:type="dxa" w:w="110"/>
@@ -1376,7 +1569,6 @@
               <w:bottom w:val="single" w:color="B9A7CB" w:sz="4"/>
               <w:right w:val="single" w:color="B9A7CB" w:sz="4"/>
             </w:tcBorders>
-            <w:shd w:fill="FFF8DC" w:color="auto" w:val="clear"/>
             <w:tcMar>
               <w:top w:type="dxa" w:w="70"/>
               <w:left w:type="dxa" w:w="110"/>
@@ -1446,7 +1638,6 @@
               <w:bottom w:val="single" w:color="B9A7CB" w:sz="4"/>
               <w:right w:val="single" w:color="B9A7CB" w:sz="4"/>
             </w:tcBorders>
-            <w:shd w:fill="FFF8DC" w:color="auto" w:val="clear"/>
             <w:tcMar>
               <w:top w:type="dxa" w:w="70"/>
               <w:left w:type="dxa" w:w="110"/>
@@ -1478,7 +1669,6 @@
               <w:bottom w:val="single" w:color="B9A7CB" w:sz="4"/>
               <w:right w:val="single" w:color="B9A7CB" w:sz="4"/>
             </w:tcBorders>
-            <w:shd w:fill="FFF8DC" w:color="auto" w:val="clear"/>
             <w:tcMar>
               <w:top w:type="dxa" w:w="70"/>
               <w:left w:type="dxa" w:w="110"/>
@@ -1510,7 +1700,6 @@
               <w:bottom w:val="single" w:color="B9A7CB" w:sz="4"/>
               <w:right w:val="single" w:color="B9A7CB" w:sz="4"/>
             </w:tcBorders>
-            <w:shd w:fill="FFF8DC" w:color="auto" w:val="clear"/>
             <w:tcMar>
               <w:top w:type="dxa" w:w="70"/>
               <w:left w:type="dxa" w:w="110"/>
@@ -1542,7 +1731,6 @@
               <w:bottom w:val="single" w:color="B9A7CB" w:sz="4"/>
               <w:right w:val="single" w:color="B9A7CB" w:sz="4"/>
             </w:tcBorders>
-            <w:shd w:fill="FFF8DC" w:color="auto" w:val="clear"/>
             <w:tcMar>
               <w:top w:type="dxa" w:w="70"/>
               <w:left w:type="dxa" w:w="110"/>
@@ -1574,7 +1762,6 @@
               <w:bottom w:val="single" w:color="B9A7CB" w:sz="4"/>
               <w:right w:val="single" w:color="B9A7CB" w:sz="4"/>
             </w:tcBorders>
-            <w:shd w:fill="FFF8DC" w:color="auto" w:val="clear"/>
             <w:tcMar>
               <w:top w:type="dxa" w:w="70"/>
               <w:left w:type="dxa" w:w="110"/>
@@ -1644,7 +1831,6 @@
               <w:bottom w:val="single" w:color="B9A7CB" w:sz="4"/>
               <w:right w:val="single" w:color="B9A7CB" w:sz="4"/>
             </w:tcBorders>
-            <w:shd w:fill="FFF8DC" w:color="auto" w:val="clear"/>
             <w:tcMar>
               <w:top w:type="dxa" w:w="70"/>
               <w:left w:type="dxa" w:w="110"/>
@@ -1676,7 +1862,6 @@
               <w:bottom w:val="single" w:color="B9A7CB" w:sz="4"/>
               <w:right w:val="single" w:color="B9A7CB" w:sz="4"/>
             </w:tcBorders>
-            <w:shd w:fill="FFF8DC" w:color="auto" w:val="clear"/>
             <w:tcMar>
               <w:top w:type="dxa" w:w="70"/>
               <w:left w:type="dxa" w:w="110"/>
@@ -1708,7 +1893,6 @@
               <w:bottom w:val="single" w:color="B9A7CB" w:sz="4"/>
               <w:right w:val="single" w:color="B9A7CB" w:sz="4"/>
             </w:tcBorders>
-            <w:shd w:fill="FFF8DC" w:color="auto" w:val="clear"/>
             <w:tcMar>
               <w:top w:type="dxa" w:w="70"/>
               <w:left w:type="dxa" w:w="110"/>
@@ -1740,7 +1924,6 @@
               <w:bottom w:val="single" w:color="B9A7CB" w:sz="4"/>
               <w:right w:val="single" w:color="B9A7CB" w:sz="4"/>
             </w:tcBorders>
-            <w:shd w:fill="FFF8DC" w:color="auto" w:val="clear"/>
             <w:tcMar>
               <w:top w:type="dxa" w:w="70"/>
               <w:left w:type="dxa" w:w="110"/>
@@ -1772,7 +1955,6 @@
               <w:bottom w:val="single" w:color="B9A7CB" w:sz="4"/>
               <w:right w:val="single" w:color="B9A7CB" w:sz="4"/>
             </w:tcBorders>
-            <w:shd w:fill="FFF8DC" w:color="auto" w:val="clear"/>
             <w:tcMar>
               <w:top w:type="dxa" w:w="70"/>
               <w:left w:type="dxa" w:w="110"/>
@@ -1842,7 +2024,6 @@
               <w:bottom w:val="single" w:color="B9A7CB" w:sz="4"/>
               <w:right w:val="single" w:color="B9A7CB" w:sz="4"/>
             </w:tcBorders>
-            <w:shd w:fill="FFF8DC" w:color="auto" w:val="clear"/>
             <w:tcMar>
               <w:top w:type="dxa" w:w="70"/>
               <w:left w:type="dxa" w:w="110"/>
@@ -1874,7 +2055,6 @@
               <w:bottom w:val="single" w:color="B9A7CB" w:sz="4"/>
               <w:right w:val="single" w:color="B9A7CB" w:sz="4"/>
             </w:tcBorders>
-            <w:shd w:fill="FFF8DC" w:color="auto" w:val="clear"/>
             <w:tcMar>
               <w:top w:type="dxa" w:w="70"/>
               <w:left w:type="dxa" w:w="110"/>
@@ -1906,7 +2086,6 @@
               <w:bottom w:val="single" w:color="B9A7CB" w:sz="4"/>
               <w:right w:val="single" w:color="B9A7CB" w:sz="4"/>
             </w:tcBorders>
-            <w:shd w:fill="FFF8DC" w:color="auto" w:val="clear"/>
             <w:tcMar>
               <w:top w:type="dxa" w:w="70"/>
               <w:left w:type="dxa" w:w="110"/>
@@ -1938,7 +2117,6 @@
               <w:bottom w:val="single" w:color="B9A7CB" w:sz="4"/>
               <w:right w:val="single" w:color="B9A7CB" w:sz="4"/>
             </w:tcBorders>
-            <w:shd w:fill="FFF8DC" w:color="auto" w:val="clear"/>
             <w:tcMar>
               <w:top w:type="dxa" w:w="70"/>
               <w:left w:type="dxa" w:w="110"/>
@@ -1970,7 +2148,6 @@
               <w:bottom w:val="single" w:color="B9A7CB" w:sz="4"/>
               <w:right w:val="single" w:color="B9A7CB" w:sz="4"/>
             </w:tcBorders>
-            <w:shd w:fill="FFF8DC" w:color="auto" w:val="clear"/>
             <w:tcMar>
               <w:top w:type="dxa" w:w="70"/>
               <w:left w:type="dxa" w:w="110"/>
@@ -2040,7 +2217,6 @@
               <w:bottom w:val="single" w:color="B9A7CB" w:sz="4"/>
               <w:right w:val="single" w:color="B9A7CB" w:sz="4"/>
             </w:tcBorders>
-            <w:shd w:fill="FFF8DC" w:color="auto" w:val="clear"/>
             <w:tcMar>
               <w:top w:type="dxa" w:w="70"/>
               <w:left w:type="dxa" w:w="110"/>
@@ -2072,7 +2248,6 @@
               <w:bottom w:val="single" w:color="B9A7CB" w:sz="4"/>
               <w:right w:val="single" w:color="B9A7CB" w:sz="4"/>
             </w:tcBorders>
-            <w:shd w:fill="FFF8DC" w:color="auto" w:val="clear"/>
             <w:tcMar>
               <w:top w:type="dxa" w:w="70"/>
               <w:left w:type="dxa" w:w="110"/>
@@ -2104,7 +2279,6 @@
               <w:bottom w:val="single" w:color="B9A7CB" w:sz="4"/>
               <w:right w:val="single" w:color="B9A7CB" w:sz="4"/>
             </w:tcBorders>
-            <w:shd w:fill="FFF8DC" w:color="auto" w:val="clear"/>
             <w:tcMar>
               <w:top w:type="dxa" w:w="70"/>
               <w:left w:type="dxa" w:w="110"/>
@@ -2136,7 +2310,6 @@
               <w:bottom w:val="single" w:color="B9A7CB" w:sz="4"/>
               <w:right w:val="single" w:color="B9A7CB" w:sz="4"/>
             </w:tcBorders>
-            <w:shd w:fill="FFF8DC" w:color="auto" w:val="clear"/>
             <w:tcMar>
               <w:top w:type="dxa" w:w="70"/>
               <w:left w:type="dxa" w:w="110"/>
@@ -2168,7 +2341,6 @@
               <w:bottom w:val="single" w:color="B9A7CB" w:sz="4"/>
               <w:right w:val="single" w:color="B9A7CB" w:sz="4"/>
             </w:tcBorders>
-            <w:shd w:fill="FFF8DC" w:color="auto" w:val="clear"/>
             <w:tcMar>
               <w:top w:type="dxa" w:w="70"/>
               <w:left w:type="dxa" w:w="110"/>
@@ -2238,7 +2410,6 @@
               <w:bottom w:val="single" w:color="B9A7CB" w:sz="4"/>
               <w:right w:val="single" w:color="B9A7CB" w:sz="4"/>
             </w:tcBorders>
-            <w:shd w:fill="FFF8DC" w:color="auto" w:val="clear"/>
             <w:tcMar>
               <w:top w:type="dxa" w:w="70"/>
               <w:left w:type="dxa" w:w="110"/>
@@ -2270,7 +2441,6 @@
               <w:bottom w:val="single" w:color="B9A7CB" w:sz="4"/>
               <w:right w:val="single" w:color="B9A7CB" w:sz="4"/>
             </w:tcBorders>
-            <w:shd w:fill="FFF8DC" w:color="auto" w:val="clear"/>
             <w:tcMar>
               <w:top w:type="dxa" w:w="70"/>
               <w:left w:type="dxa" w:w="110"/>
@@ -2302,7 +2472,6 @@
               <w:bottom w:val="single" w:color="B9A7CB" w:sz="4"/>
               <w:right w:val="single" w:color="B9A7CB" w:sz="4"/>
             </w:tcBorders>
-            <w:shd w:fill="FFF8DC" w:color="auto" w:val="clear"/>
             <w:tcMar>
               <w:top w:type="dxa" w:w="70"/>
               <w:left w:type="dxa" w:w="110"/>
@@ -2334,7 +2503,6 @@
               <w:bottom w:val="single" w:color="B9A7CB" w:sz="4"/>
               <w:right w:val="single" w:color="B9A7CB" w:sz="4"/>
             </w:tcBorders>
-            <w:shd w:fill="FFF8DC" w:color="auto" w:val="clear"/>
             <w:tcMar>
               <w:top w:type="dxa" w:w="70"/>
               <w:left w:type="dxa" w:w="110"/>
@@ -2366,7 +2534,6 @@
               <w:bottom w:val="single" w:color="B9A7CB" w:sz="4"/>
               <w:right w:val="single" w:color="B9A7CB" w:sz="4"/>
             </w:tcBorders>
-            <w:shd w:fill="FFF8DC" w:color="auto" w:val="clear"/>
             <w:tcMar>
               <w:top w:type="dxa" w:w="70"/>
               <w:left w:type="dxa" w:w="110"/>
@@ -2535,7 +2702,6 @@
               <w:bottom w:val="single" w:color="B9A7CB" w:sz="4"/>
               <w:right w:val="single" w:color="B9A7CB" w:sz="4"/>
             </w:tcBorders>
-            <w:shd w:fill="FFF8DC" w:color="auto" w:val="clear"/>
             <w:tcMar>
               <w:top w:type="dxa" w:w="70"/>
               <w:left w:type="dxa" w:w="110"/>
@@ -2607,7 +2773,6 @@
               <w:bottom w:val="single" w:color="B9A7CB" w:sz="4"/>
               <w:right w:val="single" w:color="B9A7CB" w:sz="4"/>
             </w:tcBorders>
-            <w:shd w:fill="FFF8DC" w:color="auto" w:val="clear"/>
             <w:tcMar>
               <w:top w:type="dxa" w:w="70"/>
               <w:left w:type="dxa" w:w="110"/>
@@ -2679,7 +2844,6 @@
               <w:bottom w:val="single" w:color="B9A7CB" w:sz="4"/>
               <w:right w:val="single" w:color="B9A7CB" w:sz="4"/>
             </w:tcBorders>
-            <w:shd w:fill="FFF8DC" w:color="auto" w:val="clear"/>
             <w:tcMar>
               <w:top w:type="dxa" w:w="70"/>
               <w:left w:type="dxa" w:w="110"/>
@@ -2751,7 +2915,6 @@
               <w:bottom w:val="single" w:color="B9A7CB" w:sz="4"/>
               <w:right w:val="single" w:color="B9A7CB" w:sz="4"/>
             </w:tcBorders>
-            <w:shd w:fill="FFF8DC" w:color="auto" w:val="clear"/>
             <w:tcMar>
               <w:top w:type="dxa" w:w="70"/>
               <w:left w:type="dxa" w:w="110"/>
@@ -2823,7 +2986,6 @@
               <w:bottom w:val="single" w:color="B9A7CB" w:sz="4"/>
               <w:right w:val="single" w:color="B9A7CB" w:sz="4"/>
             </w:tcBorders>
-            <w:shd w:fill="FFF8DC" w:color="auto" w:val="clear"/>
             <w:tcMar>
               <w:top w:type="dxa" w:w="70"/>
               <w:left w:type="dxa" w:w="110"/>
@@ -2921,7 +3083,6 @@
               <w:bottom w:val="single" w:color="B9A7CB" w:sz="4"/>
               <w:right w:val="single" w:color="B9A7CB" w:sz="4"/>
             </w:tcBorders>
-            <w:shd w:fill="FFF8DC" w:color="auto" w:val="clear"/>
             <w:tcMar>
               <w:top w:type="dxa" w:w="70"/>
               <w:left w:type="dxa" w:w="110"/>
@@ -2993,7 +3154,6 @@
               <w:bottom w:val="single" w:color="B9A7CB" w:sz="4"/>
               <w:right w:val="single" w:color="B9A7CB" w:sz="4"/>
             </w:tcBorders>
-            <w:shd w:fill="FFF8DC" w:color="auto" w:val="clear"/>
             <w:tcMar>
               <w:top w:type="dxa" w:w="70"/>
               <w:left w:type="dxa" w:w="110"/>
@@ -3065,7 +3225,6 @@
               <w:bottom w:val="single" w:color="B9A7CB" w:sz="4"/>
               <w:right w:val="single" w:color="B9A7CB" w:sz="4"/>
             </w:tcBorders>
-            <w:shd w:fill="FFF8DC" w:color="auto" w:val="clear"/>
             <w:tcMar>
               <w:top w:type="dxa" w:w="70"/>
               <w:left w:type="dxa" w:w="110"/>
@@ -3137,7 +3296,6 @@
               <w:bottom w:val="single" w:color="B9A7CB" w:sz="4"/>
               <w:right w:val="single" w:color="B9A7CB" w:sz="4"/>
             </w:tcBorders>
-            <w:shd w:fill="FFF8DC" w:color="auto" w:val="clear"/>
             <w:tcMar>
               <w:top w:type="dxa" w:w="70"/>
               <w:left w:type="dxa" w:w="110"/>
@@ -3209,7 +3367,6 @@
               <w:bottom w:val="single" w:color="B9A7CB" w:sz="4"/>
               <w:right w:val="single" w:color="B9A7CB" w:sz="4"/>
             </w:tcBorders>
-            <w:shd w:fill="FFF8DC" w:color="auto" w:val="clear"/>
             <w:tcMar>
               <w:top w:type="dxa" w:w="70"/>
               <w:left w:type="dxa" w:w="110"/>
@@ -3281,7 +3438,6 @@
               <w:bottom w:val="single" w:color="B9A7CB" w:sz="4"/>
               <w:right w:val="single" w:color="B9A7CB" w:sz="4"/>
             </w:tcBorders>
-            <w:shd w:fill="FFF8DC" w:color="auto" w:val="clear"/>
             <w:tcMar>
               <w:top w:type="dxa" w:w="70"/>
               <w:left w:type="dxa" w:w="110"/>
@@ -3361,7 +3517,6 @@
               <w:bottom w:val="single" w:color="B9A7CB" w:sz="4"/>
               <w:right w:val="single" w:color="B9A7CB" w:sz="4"/>
             </w:tcBorders>
-            <w:shd w:fill="FFF8DC" w:color="auto" w:val="clear"/>
             <w:tcMar>
               <w:top w:type="dxa" w:w="70"/>
               <w:left w:type="dxa" w:w="110"/>
@@ -3401,7 +3556,7 @@
                 <w:sz w:val="18"/>
                 <w:szCs w:val="18"/>
               </w:rPr>
-              <w:t xml:space="preserve">(khoanh đỏ chỗ lỗi · che thông tin khách hàng · có thể dán nhiều ảnh)</w:t>
+              <w:t xml:space="preserve">(khoanh đỏ chỗ lỗi · có thể dán nhiều ảnh)</w:t>
             </w:r>
           </w:p>
         </w:tc>
@@ -3454,7 +3609,6 @@
               <w:bottom w:val="single" w:color="B9A7CB" w:sz="4"/>
               <w:right w:val="single" w:color="B9A7CB" w:sz="4"/>
             </w:tcBorders>
-            <w:shd w:fill="FFF8DC" w:color="auto" w:val="clear"/>
             <w:tcMar>
               <w:top w:type="dxa" w:w="70"/>
               <w:left w:type="dxa" w:w="110"/>
@@ -3603,7 +3757,6 @@
               <w:bottom w:val="single" w:color="B9A7CB" w:sz="4"/>
               <w:right w:val="single" w:color="B9A7CB" w:sz="4"/>
             </w:tcBorders>
-            <w:shd w:fill="FFF8DC" w:color="auto" w:val="clear"/>
             <w:tcMar>
               <w:top w:type="dxa" w:w="70"/>
               <w:left w:type="dxa" w:w="110"/>
@@ -3675,7 +3828,6 @@
               <w:bottom w:val="single" w:color="B9A7CB" w:sz="4"/>
               <w:right w:val="single" w:color="B9A7CB" w:sz="4"/>
             </w:tcBorders>
-            <w:shd w:fill="FFF8DC" w:color="auto" w:val="clear"/>
             <w:tcMar>
               <w:top w:type="dxa" w:w="70"/>
               <w:left w:type="dxa" w:w="110"/>
@@ -3747,7 +3899,6 @@
               <w:bottom w:val="single" w:color="B9A7CB" w:sz="4"/>
               <w:right w:val="single" w:color="B9A7CB" w:sz="4"/>
             </w:tcBorders>
-            <w:shd w:fill="FFF8DC" w:color="auto" w:val="clear"/>
             <w:tcMar>
               <w:top w:type="dxa" w:w="70"/>
               <w:left w:type="dxa" w:w="110"/>
@@ -3819,7 +3970,6 @@
               <w:bottom w:val="single" w:color="B9A7CB" w:sz="4"/>
               <w:right w:val="single" w:color="B9A7CB" w:sz="4"/>
             </w:tcBorders>
-            <w:shd w:fill="FFF8DC" w:color="auto" w:val="clear"/>
             <w:tcMar>
               <w:top w:type="dxa" w:w="70"/>
               <w:left w:type="dxa" w:w="110"/>
@@ -3891,7 +4041,6 @@
               <w:bottom w:val="single" w:color="B9A7CB" w:sz="4"/>
               <w:right w:val="single" w:color="B9A7CB" w:sz="4"/>
             </w:tcBorders>
-            <w:shd w:fill="FFF8DC" w:color="auto" w:val="clear"/>
             <w:tcMar>
               <w:top w:type="dxa" w:w="70"/>
               <w:left w:type="dxa" w:w="110"/>
@@ -3989,7 +4138,6 @@
               <w:bottom w:val="single" w:color="B9A7CB" w:sz="4"/>
               <w:right w:val="single" w:color="B9A7CB" w:sz="4"/>
             </w:tcBorders>
-            <w:shd w:fill="FFF8DC" w:color="auto" w:val="clear"/>
             <w:tcMar>
               <w:top w:type="dxa" w:w="70"/>
               <w:left w:type="dxa" w:w="110"/>
@@ -4061,7 +4209,6 @@
               <w:bottom w:val="single" w:color="B9A7CB" w:sz="4"/>
               <w:right w:val="single" w:color="B9A7CB" w:sz="4"/>
             </w:tcBorders>
-            <w:shd w:fill="FFF8DC" w:color="auto" w:val="clear"/>
             <w:tcMar>
               <w:top w:type="dxa" w:w="70"/>
               <w:left w:type="dxa" w:w="110"/>
@@ -4133,7 +4280,6 @@
               <w:bottom w:val="single" w:color="B9A7CB" w:sz="4"/>
               <w:right w:val="single" w:color="B9A7CB" w:sz="4"/>
             </w:tcBorders>
-            <w:shd w:fill="FFF8DC" w:color="auto" w:val="clear"/>
             <w:tcMar>
               <w:top w:type="dxa" w:w="70"/>
               <w:left w:type="dxa" w:w="110"/>
@@ -4205,7 +4351,6 @@
               <w:bottom w:val="single" w:color="B9A7CB" w:sz="4"/>
               <w:right w:val="single" w:color="B9A7CB" w:sz="4"/>
             </w:tcBorders>
-            <w:shd w:fill="FFF8DC" w:color="auto" w:val="clear"/>
             <w:tcMar>
               <w:top w:type="dxa" w:w="70"/>
               <w:left w:type="dxa" w:w="110"/>
@@ -4277,7 +4422,6 @@
               <w:bottom w:val="single" w:color="B9A7CB" w:sz="4"/>
               <w:right w:val="single" w:color="B9A7CB" w:sz="4"/>
             </w:tcBorders>
-            <w:shd w:fill="FFF8DC" w:color="auto" w:val="clear"/>
             <w:tcMar>
               <w:top w:type="dxa" w:w="70"/>
               <w:left w:type="dxa" w:w="110"/>
@@ -4349,7 +4493,6 @@
               <w:bottom w:val="single" w:color="B9A7CB" w:sz="4"/>
               <w:right w:val="single" w:color="B9A7CB" w:sz="4"/>
             </w:tcBorders>
-            <w:shd w:fill="FFF8DC" w:color="auto" w:val="clear"/>
             <w:tcMar>
               <w:top w:type="dxa" w:w="70"/>
               <w:left w:type="dxa" w:w="110"/>
@@ -4429,7 +4572,6 @@
               <w:bottom w:val="single" w:color="B9A7CB" w:sz="4"/>
               <w:right w:val="single" w:color="B9A7CB" w:sz="4"/>
             </w:tcBorders>
-            <w:shd w:fill="FFF8DC" w:color="auto" w:val="clear"/>
             <w:tcMar>
               <w:top w:type="dxa" w:w="70"/>
               <w:left w:type="dxa" w:w="110"/>
@@ -4469,7 +4611,7 @@
                 <w:sz w:val="18"/>
                 <w:szCs w:val="18"/>
               </w:rPr>
-              <w:t xml:space="preserve">(khoanh đỏ chỗ lỗi · che thông tin khách hàng · có thể dán nhiều ảnh)</w:t>
+              <w:t xml:space="preserve">(khoanh đỏ chỗ lỗi · có thể dán nhiều ảnh)</w:t>
             </w:r>
           </w:p>
         </w:tc>
@@ -4522,7 +4664,6 @@
               <w:bottom w:val="single" w:color="B9A7CB" w:sz="4"/>
               <w:right w:val="single" w:color="B9A7CB" w:sz="4"/>
             </w:tcBorders>
-            <w:shd w:fill="FFF8DC" w:color="auto" w:val="clear"/>
             <w:tcMar>
               <w:top w:type="dxa" w:w="70"/>
               <w:left w:type="dxa" w:w="110"/>
@@ -4671,7 +4812,6 @@
               <w:bottom w:val="single" w:color="B9A7CB" w:sz="4"/>
               <w:right w:val="single" w:color="B9A7CB" w:sz="4"/>
             </w:tcBorders>
-            <w:shd w:fill="FFF8DC" w:color="auto" w:val="clear"/>
             <w:tcMar>
               <w:top w:type="dxa" w:w="70"/>
               <w:left w:type="dxa" w:w="110"/>
@@ -4743,7 +4883,6 @@
               <w:bottom w:val="single" w:color="B9A7CB" w:sz="4"/>
               <w:right w:val="single" w:color="B9A7CB" w:sz="4"/>
             </w:tcBorders>
-            <w:shd w:fill="FFF8DC" w:color="auto" w:val="clear"/>
             <w:tcMar>
               <w:top w:type="dxa" w:w="70"/>
               <w:left w:type="dxa" w:w="110"/>
@@ -4815,7 +4954,6 @@
               <w:bottom w:val="single" w:color="B9A7CB" w:sz="4"/>
               <w:right w:val="single" w:color="B9A7CB" w:sz="4"/>
             </w:tcBorders>
-            <w:shd w:fill="FFF8DC" w:color="auto" w:val="clear"/>
             <w:tcMar>
               <w:top w:type="dxa" w:w="70"/>
               <w:left w:type="dxa" w:w="110"/>
@@ -4887,7 +5025,6 @@
               <w:bottom w:val="single" w:color="B9A7CB" w:sz="4"/>
               <w:right w:val="single" w:color="B9A7CB" w:sz="4"/>
             </w:tcBorders>
-            <w:shd w:fill="FFF8DC" w:color="auto" w:val="clear"/>
             <w:tcMar>
               <w:top w:type="dxa" w:w="70"/>
               <w:left w:type="dxa" w:w="110"/>
@@ -4959,7 +5096,6 @@
               <w:bottom w:val="single" w:color="B9A7CB" w:sz="4"/>
               <w:right w:val="single" w:color="B9A7CB" w:sz="4"/>
             </w:tcBorders>
-            <w:shd w:fill="FFF8DC" w:color="auto" w:val="clear"/>
             <w:tcMar>
               <w:top w:type="dxa" w:w="70"/>
               <w:left w:type="dxa" w:w="110"/>
@@ -5057,7 +5193,6 @@
               <w:bottom w:val="single" w:color="B9A7CB" w:sz="4"/>
               <w:right w:val="single" w:color="B9A7CB" w:sz="4"/>
             </w:tcBorders>
-            <w:shd w:fill="FFF8DC" w:color="auto" w:val="clear"/>
             <w:tcMar>
               <w:top w:type="dxa" w:w="70"/>
               <w:left w:type="dxa" w:w="110"/>
@@ -5129,7 +5264,6 @@
               <w:bottom w:val="single" w:color="B9A7CB" w:sz="4"/>
               <w:right w:val="single" w:color="B9A7CB" w:sz="4"/>
             </w:tcBorders>
-            <w:shd w:fill="FFF8DC" w:color="auto" w:val="clear"/>
             <w:tcMar>
               <w:top w:type="dxa" w:w="70"/>
               <w:left w:type="dxa" w:w="110"/>
@@ -5201,7 +5335,6 @@
               <w:bottom w:val="single" w:color="B9A7CB" w:sz="4"/>
               <w:right w:val="single" w:color="B9A7CB" w:sz="4"/>
             </w:tcBorders>
-            <w:shd w:fill="FFF8DC" w:color="auto" w:val="clear"/>
             <w:tcMar>
               <w:top w:type="dxa" w:w="70"/>
               <w:left w:type="dxa" w:w="110"/>
@@ -5273,7 +5406,6 @@
               <w:bottom w:val="single" w:color="B9A7CB" w:sz="4"/>
               <w:right w:val="single" w:color="B9A7CB" w:sz="4"/>
             </w:tcBorders>
-            <w:shd w:fill="FFF8DC" w:color="auto" w:val="clear"/>
             <w:tcMar>
               <w:top w:type="dxa" w:w="70"/>
               <w:left w:type="dxa" w:w="110"/>
@@ -5345,7 +5477,6 @@
               <w:bottom w:val="single" w:color="B9A7CB" w:sz="4"/>
               <w:right w:val="single" w:color="B9A7CB" w:sz="4"/>
             </w:tcBorders>
-            <w:shd w:fill="FFF8DC" w:color="auto" w:val="clear"/>
             <w:tcMar>
               <w:top w:type="dxa" w:w="70"/>
               <w:left w:type="dxa" w:w="110"/>
@@ -5417,7 +5548,6 @@
               <w:bottom w:val="single" w:color="B9A7CB" w:sz="4"/>
               <w:right w:val="single" w:color="B9A7CB" w:sz="4"/>
             </w:tcBorders>
-            <w:shd w:fill="FFF8DC" w:color="auto" w:val="clear"/>
             <w:tcMar>
               <w:top w:type="dxa" w:w="70"/>
               <w:left w:type="dxa" w:w="110"/>
@@ -5497,7 +5627,6 @@
               <w:bottom w:val="single" w:color="B9A7CB" w:sz="4"/>
               <w:right w:val="single" w:color="B9A7CB" w:sz="4"/>
             </w:tcBorders>
-            <w:shd w:fill="FFF8DC" w:color="auto" w:val="clear"/>
             <w:tcMar>
               <w:top w:type="dxa" w:w="70"/>
               <w:left w:type="dxa" w:w="110"/>
@@ -5537,7 +5666,7 @@
                 <w:sz w:val="18"/>
                 <w:szCs w:val="18"/>
               </w:rPr>
-              <w:t xml:space="preserve">(khoanh đỏ chỗ lỗi · che thông tin khách hàng · có thể dán nhiều ảnh)</w:t>
+              <w:t xml:space="preserve">(khoanh đỏ chỗ lỗi · có thể dán nhiều ảnh)</w:t>
             </w:r>
           </w:p>
         </w:tc>
@@ -5590,7 +5719,6 @@
               <w:bottom w:val="single" w:color="B9A7CB" w:sz="4"/>
               <w:right w:val="single" w:color="B9A7CB" w:sz="4"/>
             </w:tcBorders>
-            <w:shd w:fill="FFF8DC" w:color="auto" w:val="clear"/>
             <w:tcMar>
               <w:top w:type="dxa" w:w="70"/>
               <w:left w:type="dxa" w:w="110"/>
@@ -9039,12 +9167,6 @@
   </w:abstractNum>
   <w:num w:numId="1">
     <w:abstractNumId w:val="1"/>
-    <w:lvlOverride w:ilvl="0">
-      <w:startOverride w:val="1"/>
-    </w:lvlOverride>
-  </w:num>
-  <w:num w:numId="2">
-    <w:abstractNumId w:val="2"/>
     <w:lvlOverride w:ilvl="0">
       <w:startOverride w:val="1"/>
     </w:lvlOverride>

</xml_diff>